<commit_message>
ML Notes and Purchase Prediction based on Social Media Ads
</commit_message>
<xml_diff>
--- a/Machine Learning/Machine Learning Notes.docx
+++ b/Machine Learning/Machine Learning Notes.docx
@@ -151,6 +151,49 @@
         </w:drawing>
       </w:r>
     </w:p>
+    <w:p>
+      <w:r>
+        <w:rPr>
+          <w:noProof/>
+        </w:rPr>
+        <w:lastRenderedPageBreak/>
+        <w:drawing>
+          <wp:inline distT="0" distB="0" distL="0" distR="0" wp14:anchorId="69AB68A4" wp14:editId="65C1DB00">
+            <wp:extent cx="5731510" cy="3178810"/>
+            <wp:effectExtent l="0" t="0" r="2540" b="2540"/>
+            <wp:docPr id="885722082" name="Picture 1"/>
+            <wp:cNvGraphicFramePr>
+              <a:graphicFrameLocks xmlns:a="http://schemas.openxmlformats.org/drawingml/2006/main" noChangeAspect="1"/>
+            </wp:cNvGraphicFramePr>
+            <a:graphic xmlns:a="http://schemas.openxmlformats.org/drawingml/2006/main">
+              <a:graphicData uri="http://schemas.openxmlformats.org/drawingml/2006/picture">
+                <pic:pic xmlns:pic="http://schemas.openxmlformats.org/drawingml/2006/picture">
+                  <pic:nvPicPr>
+                    <pic:cNvPr id="885722082" name=""/>
+                    <pic:cNvPicPr/>
+                  </pic:nvPicPr>
+                  <pic:blipFill>
+                    <a:blip r:embed="rId8"/>
+                    <a:stretch>
+                      <a:fillRect/>
+                    </a:stretch>
+                  </pic:blipFill>
+                  <pic:spPr>
+                    <a:xfrm>
+                      <a:off x="0" y="0"/>
+                      <a:ext cx="5731510" cy="3178810"/>
+                    </a:xfrm>
+                    <a:prstGeom prst="rect">
+                      <a:avLst/>
+                    </a:prstGeom>
+                  </pic:spPr>
+                </pic:pic>
+              </a:graphicData>
+            </a:graphic>
+          </wp:inline>
+        </w:drawing>
+      </w:r>
+    </w:p>
     <w:p/>
     <w:p>
       <w:r>
@@ -168,6 +211,7 @@
         <w:rPr>
           <w:lang w:val="en-US"/>
         </w:rPr>
+        <w:lastRenderedPageBreak/>
         <w:t>Linear Regression Algorithms</w:t>
       </w:r>
     </w:p>
@@ -323,11 +367,9 @@
         </w:rPr>
         <w:t>​</w:t>
       </w:r>
-      <w:proofErr w:type="spellStart"/>
       <w:r>
         <w:t>Xn</w:t>
       </w:r>
-      <w:proofErr w:type="spellEnd"/>
       <w:r>
         <w:rPr>
           <w:rFonts w:ascii="Arial" w:hAnsi="Arial" w:cs="Arial"/>
@@ -374,13 +416,8 @@
         </w:numPr>
       </w:pPr>
       <w:r>
-        <w:t>β</w:t>
-      </w:r>
-      <w:proofErr w:type="spellStart"/>
-      <w:r>
-        <w:t>i</w:t>
-      </w:r>
-      <w:proofErr w:type="spellEnd"/>
+        <w:t>βi</w:t>
+      </w:r>
       <w:r>
         <w:rPr>
           <w:rFonts w:ascii="Arial" w:hAnsi="Arial" w:cs="Arial"/>
@@ -404,7 +441,6 @@
           <w:numId w:val="2"/>
         </w:numPr>
       </w:pPr>
-      <w:proofErr w:type="gramStart"/>
       <w:r>
         <w:t>ϵ</w:t>
       </w:r>
@@ -412,11 +448,7 @@
         <w:t xml:space="preserve"> </w:t>
       </w:r>
       <w:r>
-        <w:t xml:space="preserve"> is</w:t>
-      </w:r>
-      <w:proofErr w:type="gramEnd"/>
-      <w:r>
-        <w:t xml:space="preserve"> the error term</w:t>
+        <w:t xml:space="preserve"> is the error term</w:t>
       </w:r>
     </w:p>
     <w:p/>
@@ -441,7 +473,7 @@
                     <pic:cNvPicPr/>
                   </pic:nvPicPr>
                   <pic:blipFill>
-                    <a:blip r:embed="rId8"/>
+                    <a:blip r:embed="rId9"/>
                     <a:stretch>
                       <a:fillRect/>
                     </a:stretch>
@@ -483,7 +515,7 @@
                     <pic:cNvPicPr/>
                   </pic:nvPicPr>
                   <pic:blipFill>
-                    <a:blip r:embed="rId9"/>
+                    <a:blip r:embed="rId10"/>
                     <a:stretch>
                       <a:fillRect/>
                     </a:stretch>
@@ -509,6 +541,7 @@
         <w:rPr>
           <w:noProof/>
         </w:rPr>
+        <w:lastRenderedPageBreak/>
         <w:drawing>
           <wp:inline distT="0" distB="0" distL="0" distR="0" wp14:anchorId="5826FE9D" wp14:editId="6B02A2D3">
             <wp:extent cx="5340624" cy="1524078"/>
@@ -525,7 +558,7 @@
                     <pic:cNvPicPr/>
                   </pic:nvPicPr>
                   <pic:blipFill>
-                    <a:blip r:embed="rId10"/>
+                    <a:blip r:embed="rId11"/>
                     <a:stretch>
                       <a:fillRect/>
                     </a:stretch>
@@ -567,7 +600,7 @@
                     <pic:cNvPicPr/>
                   </pic:nvPicPr>
                   <pic:blipFill>
-                    <a:blip r:embed="rId11"/>
+                    <a:blip r:embed="rId12"/>
                     <a:stretch>
                       <a:fillRect/>
                     </a:stretch>
@@ -609,7 +642,7 @@
                     <pic:cNvPicPr/>
                   </pic:nvPicPr>
                   <pic:blipFill>
-                    <a:blip r:embed="rId12"/>
+                    <a:blip r:embed="rId13"/>
                     <a:stretch>
                       <a:fillRect/>
                     </a:stretch>
@@ -651,7 +684,7 @@
                     <pic:cNvPicPr/>
                   </pic:nvPicPr>
                   <pic:blipFill>
-                    <a:blip r:embed="rId13"/>
+                    <a:blip r:embed="rId14"/>
                     <a:stretch>
                       <a:fillRect/>
                     </a:stretch>
@@ -693,7 +726,7 @@
                     <pic:cNvPicPr/>
                   </pic:nvPicPr>
                   <pic:blipFill>
-                    <a:blip r:embed="rId14"/>
+                    <a:blip r:embed="rId15"/>
                     <a:stretch>
                       <a:fillRect/>
                     </a:stretch>
@@ -723,13 +756,9 @@
       <w:pPr>
         <w:pStyle w:val="Heading1"/>
       </w:pPr>
-      <w:proofErr w:type="gramStart"/>
-      <w:r>
-        <w:t>Non Linear</w:t>
-      </w:r>
-      <w:proofErr w:type="gramEnd"/>
-      <w:r>
-        <w:t xml:space="preserve"> Regression</w:t>
+      <w:r>
+        <w:lastRenderedPageBreak/>
+        <w:t>Non Linear Regression</w:t>
       </w:r>
     </w:p>
     <w:p>
@@ -774,23 +803,7 @@
           <w:b/>
           <w:bCs/>
         </w:rPr>
-        <w:t xml:space="preserve">cannot be </w:t>
-      </w:r>
-      <w:proofErr w:type="spellStart"/>
-      <w:r>
-        <w:rPr>
-          <w:b/>
-          <w:bCs/>
-        </w:rPr>
-        <w:t>modeled</w:t>
-      </w:r>
-      <w:proofErr w:type="spellEnd"/>
-      <w:r>
-        <w:rPr>
-          <w:b/>
-          <w:bCs/>
-        </w:rPr>
-        <w:t xml:space="preserve"> using a straight line</w:t>
+        <w:t>cannot be modeled using a straight line</w:t>
       </w:r>
       <w:r>
         <w:t>.</w:t>
@@ -818,7 +831,7 @@
                     <pic:cNvPicPr/>
                   </pic:nvPicPr>
                   <pic:blipFill>
-                    <a:blip r:embed="rId15"/>
+                    <a:blip r:embed="rId16"/>
                     <a:stretch>
                       <a:fillRect/>
                     </a:stretch>
@@ -860,7 +873,7 @@
                     <pic:cNvPicPr/>
                   </pic:nvPicPr>
                   <pic:blipFill>
-                    <a:blip r:embed="rId16"/>
+                    <a:blip r:embed="rId17"/>
                     <a:stretch>
                       <a:fillRect/>
                     </a:stretch>
@@ -902,7 +915,7 @@
                     <pic:cNvPicPr/>
                   </pic:nvPicPr>
                   <pic:blipFill>
-                    <a:blip r:embed="rId17"/>
+                    <a:blip r:embed="rId18"/>
                     <a:stretch>
                       <a:fillRect/>
                     </a:stretch>
@@ -944,7 +957,7 @@
                     <pic:cNvPicPr/>
                   </pic:nvPicPr>
                   <pic:blipFill>
-                    <a:blip r:embed="rId18"/>
+                    <a:blip r:embed="rId19"/>
                     <a:stretch>
                       <a:fillRect/>
                     </a:stretch>
@@ -986,7 +999,7 @@
                     <pic:cNvPicPr/>
                   </pic:nvPicPr>
                   <pic:blipFill>
-                    <a:blip r:embed="rId19"/>
+                    <a:blip r:embed="rId20"/>
                     <a:stretch>
                       <a:fillRect/>
                     </a:stretch>
@@ -1012,6 +1025,7 @@
         <w:rPr>
           <w:noProof/>
         </w:rPr>
+        <w:lastRenderedPageBreak/>
         <w:drawing>
           <wp:inline distT="0" distB="0" distL="0" distR="0" wp14:anchorId="1840829E" wp14:editId="360059D4">
             <wp:extent cx="5731510" cy="1477010"/>
@@ -1028,7 +1042,7 @@
                     <pic:cNvPicPr/>
                   </pic:nvPicPr>
                   <pic:blipFill>
-                    <a:blip r:embed="rId20"/>
+                    <a:blip r:embed="rId21"/>
                     <a:stretch>
                       <a:fillRect/>
                     </a:stretch>
@@ -1051,6 +1065,45 @@
     </w:p>
     <w:p>
       <w:r>
+        <w:drawing>
+          <wp:inline distT="0" distB="0" distL="0" distR="0" wp14:anchorId="291524A4" wp14:editId="2B2B8265">
+            <wp:extent cx="5505733" cy="1797142"/>
+            <wp:effectExtent l="0" t="0" r="0" b="0"/>
+            <wp:docPr id="2078221955" name="Picture 1"/>
+            <wp:cNvGraphicFramePr>
+              <a:graphicFrameLocks xmlns:a="http://schemas.openxmlformats.org/drawingml/2006/main" noChangeAspect="1"/>
+            </wp:cNvGraphicFramePr>
+            <a:graphic xmlns:a="http://schemas.openxmlformats.org/drawingml/2006/main">
+              <a:graphicData uri="http://schemas.openxmlformats.org/drawingml/2006/picture">
+                <pic:pic xmlns:pic="http://schemas.openxmlformats.org/drawingml/2006/picture">
+                  <pic:nvPicPr>
+                    <pic:cNvPr id="2078221955" name=""/>
+                    <pic:cNvPicPr/>
+                  </pic:nvPicPr>
+                  <pic:blipFill>
+                    <a:blip r:embed="rId22"/>
+                    <a:stretch>
+                      <a:fillRect/>
+                    </a:stretch>
+                  </pic:blipFill>
+                  <pic:spPr>
+                    <a:xfrm>
+                      <a:off x="0" y="0"/>
+                      <a:ext cx="5505733" cy="1797142"/>
+                    </a:xfrm>
+                    <a:prstGeom prst="rect">
+                      <a:avLst/>
+                    </a:prstGeom>
+                  </pic:spPr>
+                </pic:pic>
+              </a:graphicData>
+            </a:graphic>
+          </wp:inline>
+        </w:drawing>
+      </w:r>
+    </w:p>
+    <w:p>
+      <w:r>
         <w:rPr>
           <w:noProof/>
         </w:rPr>
@@ -1070,7 +1123,7 @@
                     <pic:cNvPicPr/>
                   </pic:nvPicPr>
                   <pic:blipFill>
-                    <a:blip r:embed="rId21"/>
+                    <a:blip r:embed="rId23"/>
                     <a:stretch>
                       <a:fillRect/>
                     </a:stretch>
@@ -1112,7 +1165,7 @@
                     <pic:cNvPicPr/>
                   </pic:nvPicPr>
                   <pic:blipFill>
-                    <a:blip r:embed="rId22"/>
+                    <a:blip r:embed="rId24"/>
                     <a:stretch>
                       <a:fillRect/>
                     </a:stretch>
@@ -1205,6 +1258,7 @@
                 <w:b/>
                 <w:bCs/>
               </w:rPr>
+              <w:lastRenderedPageBreak/>
               <w:t>Feature</w:t>
             </w:r>
           </w:p>
@@ -1507,6 +1561,9 @@
     </w:p>
     <w:p>
       <w:r>
+        <w:rPr>
+          <w:noProof/>
+        </w:rPr>
         <w:drawing>
           <wp:inline distT="0" distB="0" distL="0" distR="0" wp14:anchorId="05022658" wp14:editId="2239D30D">
             <wp:extent cx="5731510" cy="2538730"/>
@@ -1523,7 +1580,7 @@
                     <pic:cNvPicPr/>
                   </pic:nvPicPr>
                   <pic:blipFill>
-                    <a:blip r:embed="rId23"/>
+                    <a:blip r:embed="rId25"/>
                     <a:stretch>
                       <a:fillRect/>
                     </a:stretch>
@@ -1546,6 +1603,9 @@
     </w:p>
     <w:p>
       <w:r>
+        <w:rPr>
+          <w:noProof/>
+        </w:rPr>
         <w:drawing>
           <wp:inline distT="0" distB="0" distL="0" distR="0" wp14:anchorId="562E94DF" wp14:editId="7F1EBD96">
             <wp:extent cx="5731510" cy="1903095"/>
@@ -1562,7 +1622,7 @@
                     <pic:cNvPicPr/>
                   </pic:nvPicPr>
                   <pic:blipFill>
-                    <a:blip r:embed="rId24"/>
+                    <a:blip r:embed="rId26"/>
                     <a:stretch>
                       <a:fillRect/>
                     </a:stretch>
@@ -1588,6 +1648,7 @@
         <w:pStyle w:val="Heading1"/>
       </w:pPr>
       <w:r>
+        <w:lastRenderedPageBreak/>
         <w:t>Classification Algorithms</w:t>
       </w:r>
     </w:p>
@@ -1615,7 +1676,7 @@
                     <pic:cNvPicPr/>
                   </pic:nvPicPr>
                   <pic:blipFill>
-                    <a:blip r:embed="rId25"/>
+                    <a:blip r:embed="rId27"/>
                     <a:stretch>
                       <a:fillRect/>
                     </a:stretch>
@@ -1657,7 +1718,7 @@
                     <pic:cNvPicPr/>
                   </pic:nvPicPr>
                   <pic:blipFill>
-                    <a:blip r:embed="rId26"/>
+                    <a:blip r:embed="rId28"/>
                     <a:stretch>
                       <a:fillRect/>
                     </a:stretch>
@@ -1699,7 +1760,7 @@
                     <pic:cNvPicPr/>
                   </pic:nvPicPr>
                   <pic:blipFill>
-                    <a:blip r:embed="rId27"/>
+                    <a:blip r:embed="rId29"/>
                     <a:stretch>
                       <a:fillRect/>
                     </a:stretch>
@@ -1725,6 +1786,7 @@
         <w:rPr>
           <w:noProof/>
         </w:rPr>
+        <w:lastRenderedPageBreak/>
         <w:drawing>
           <wp:inline distT="0" distB="0" distL="0" distR="0" wp14:anchorId="160D8BFE" wp14:editId="4206A9CB">
             <wp:extent cx="5731510" cy="2541270"/>
@@ -1741,7 +1803,7 @@
                     <pic:cNvPicPr/>
                   </pic:nvPicPr>
                   <pic:blipFill>
-                    <a:blip r:embed="rId28"/>
+                    <a:blip r:embed="rId30"/>
                     <a:stretch>
                       <a:fillRect/>
                     </a:stretch>
@@ -1783,7 +1845,7 @@
                     <pic:cNvPicPr/>
                   </pic:nvPicPr>
                   <pic:blipFill>
-                    <a:blip r:embed="rId29"/>
+                    <a:blip r:embed="rId31"/>
                     <a:stretch>
                       <a:fillRect/>
                     </a:stretch>
@@ -1825,7 +1887,7 @@
                     <pic:cNvPicPr/>
                   </pic:nvPicPr>
                   <pic:blipFill>
-                    <a:blip r:embed="rId30"/>
+                    <a:blip r:embed="rId32"/>
                     <a:stretch>
                       <a:fillRect/>
                     </a:stretch>
@@ -1851,6 +1913,7 @@
         <w:rPr>
           <w:noProof/>
         </w:rPr>
+        <w:lastRenderedPageBreak/>
         <w:drawing>
           <wp:inline distT="0" distB="0" distL="0" distR="0" wp14:anchorId="11A2CB1A" wp14:editId="5294EC5F">
             <wp:extent cx="5731510" cy="2440940"/>
@@ -1867,7 +1930,7 @@
                     <pic:cNvPicPr/>
                   </pic:nvPicPr>
                   <pic:blipFill>
-                    <a:blip r:embed="rId31"/>
+                    <a:blip r:embed="rId33"/>
                     <a:stretch>
                       <a:fillRect/>
                     </a:stretch>
@@ -1910,7 +1973,7 @@
                     <pic:cNvPicPr/>
                   </pic:nvPicPr>
                   <pic:blipFill>
-                    <a:blip r:embed="rId32"/>
+                    <a:blip r:embed="rId34"/>
                     <a:stretch>
                       <a:fillRect/>
                     </a:stretch>

</xml_diff>

<commit_message>
Added Notes for Gamma and Kernel in SVM
</commit_message>
<xml_diff>
--- a/Machine Learning/Machine Learning Notes.docx
+++ b/Machine Learning/Machine Learning Notes.docx
@@ -367,9 +367,11 @@
         </w:rPr>
         <w:t>​</w:t>
       </w:r>
+      <w:proofErr w:type="spellStart"/>
       <w:r>
         <w:t>Xn</w:t>
       </w:r>
+      <w:proofErr w:type="spellEnd"/>
       <w:r>
         <w:rPr>
           <w:rFonts w:ascii="Arial" w:hAnsi="Arial" w:cs="Arial"/>
@@ -416,8 +418,13 @@
         </w:numPr>
       </w:pPr>
       <w:r>
-        <w:t>βi</w:t>
-      </w:r>
+        <w:t>β</w:t>
+      </w:r>
+      <w:proofErr w:type="spellStart"/>
+      <w:r>
+        <w:t>i</w:t>
+      </w:r>
+      <w:proofErr w:type="spellEnd"/>
       <w:r>
         <w:rPr>
           <w:rFonts w:ascii="Arial" w:hAnsi="Arial" w:cs="Arial"/>
@@ -441,6 +448,7 @@
           <w:numId w:val="2"/>
         </w:numPr>
       </w:pPr>
+      <w:proofErr w:type="gramStart"/>
       <w:r>
         <w:t>ϵ</w:t>
       </w:r>
@@ -448,7 +456,11 @@
         <w:t xml:space="preserve"> </w:t>
       </w:r>
       <w:r>
-        <w:t xml:space="preserve"> is the error term</w:t>
+        <w:t xml:space="preserve"> is</w:t>
+      </w:r>
+      <w:proofErr w:type="gramEnd"/>
+      <w:r>
+        <w:t xml:space="preserve"> the error term</w:t>
       </w:r>
     </w:p>
     <w:p/>
@@ -756,9 +768,14 @@
       <w:pPr>
         <w:pStyle w:val="Heading1"/>
       </w:pPr>
+      <w:proofErr w:type="gramStart"/>
       <w:r>
         <w:lastRenderedPageBreak/>
-        <w:t>Non Linear Regression</w:t>
+        <w:t>Non Linear</w:t>
+      </w:r>
+      <w:proofErr w:type="gramEnd"/>
+      <w:r>
+        <w:t xml:space="preserve"> Regression</w:t>
       </w:r>
     </w:p>
     <w:p>
@@ -803,7 +820,23 @@
           <w:b/>
           <w:bCs/>
         </w:rPr>
-        <w:t>cannot be modeled using a straight line</w:t>
+        <w:t xml:space="preserve">cannot be </w:t>
+      </w:r>
+      <w:proofErr w:type="spellStart"/>
+      <w:r>
+        <w:rPr>
+          <w:b/>
+          <w:bCs/>
+        </w:rPr>
+        <w:t>modeled</w:t>
+      </w:r>
+      <w:proofErr w:type="spellEnd"/>
+      <w:r>
+        <w:rPr>
+          <w:b/>
+          <w:bCs/>
+        </w:rPr>
+        <w:t xml:space="preserve"> using a straight line</w:t>
       </w:r>
       <w:r>
         <w:t>.</w:t>
@@ -1065,6 +1098,9 @@
     </w:p>
     <w:p>
       <w:r>
+        <w:rPr>
+          <w:noProof/>
+        </w:rPr>
         <w:drawing>
           <wp:inline distT="0" distB="0" distL="0" distR="0" wp14:anchorId="291524A4" wp14:editId="2B2B8265">
             <wp:extent cx="5505733" cy="1797142"/>
@@ -1781,12 +1817,132 @@
         </w:drawing>
       </w:r>
     </w:p>
+    <w:p/>
+    <w:p>
+      <w:r>
+        <w:lastRenderedPageBreak/>
+        <w:drawing>
+          <wp:inline distT="0" distB="0" distL="0" distR="0" wp14:anchorId="323A539C" wp14:editId="75BE3B78">
+            <wp:extent cx="5731510" cy="3107690"/>
+            <wp:effectExtent l="0" t="0" r="2540" b="0"/>
+            <wp:docPr id="1972932482" name="Picture 1"/>
+            <wp:cNvGraphicFramePr>
+              <a:graphicFrameLocks xmlns:a="http://schemas.openxmlformats.org/drawingml/2006/main" noChangeAspect="1"/>
+            </wp:cNvGraphicFramePr>
+            <a:graphic xmlns:a="http://schemas.openxmlformats.org/drawingml/2006/main">
+              <a:graphicData uri="http://schemas.openxmlformats.org/drawingml/2006/picture">
+                <pic:pic xmlns:pic="http://schemas.openxmlformats.org/drawingml/2006/picture">
+                  <pic:nvPicPr>
+                    <pic:cNvPr id="1972932482" name=""/>
+                    <pic:cNvPicPr/>
+                  </pic:nvPicPr>
+                  <pic:blipFill>
+                    <a:blip r:embed="rId30"/>
+                    <a:stretch>
+                      <a:fillRect/>
+                    </a:stretch>
+                  </pic:blipFill>
+                  <pic:spPr>
+                    <a:xfrm>
+                      <a:off x="0" y="0"/>
+                      <a:ext cx="5731510" cy="3107690"/>
+                    </a:xfrm>
+                    <a:prstGeom prst="rect">
+                      <a:avLst/>
+                    </a:prstGeom>
+                  </pic:spPr>
+                </pic:pic>
+              </a:graphicData>
+            </a:graphic>
+          </wp:inline>
+        </w:drawing>
+      </w:r>
+    </w:p>
+    <w:p>
+      <w:r>
+        <w:drawing>
+          <wp:inline distT="0" distB="0" distL="0" distR="0" wp14:anchorId="096DE643" wp14:editId="7AF26DAA">
+            <wp:extent cx="5731510" cy="2493010"/>
+            <wp:effectExtent l="0" t="0" r="2540" b="2540"/>
+            <wp:docPr id="1283985158" name="Picture 1"/>
+            <wp:cNvGraphicFramePr>
+              <a:graphicFrameLocks xmlns:a="http://schemas.openxmlformats.org/drawingml/2006/main" noChangeAspect="1"/>
+            </wp:cNvGraphicFramePr>
+            <a:graphic xmlns:a="http://schemas.openxmlformats.org/drawingml/2006/main">
+              <a:graphicData uri="http://schemas.openxmlformats.org/drawingml/2006/picture">
+                <pic:pic xmlns:pic="http://schemas.openxmlformats.org/drawingml/2006/picture">
+                  <pic:nvPicPr>
+                    <pic:cNvPr id="1283985158" name=""/>
+                    <pic:cNvPicPr/>
+                  </pic:nvPicPr>
+                  <pic:blipFill>
+                    <a:blip r:embed="rId31"/>
+                    <a:stretch>
+                      <a:fillRect/>
+                    </a:stretch>
+                  </pic:blipFill>
+                  <pic:spPr>
+                    <a:xfrm>
+                      <a:off x="0" y="0"/>
+                      <a:ext cx="5731510" cy="2493010"/>
+                    </a:xfrm>
+                    <a:prstGeom prst="rect">
+                      <a:avLst/>
+                    </a:prstGeom>
+                  </pic:spPr>
+                </pic:pic>
+              </a:graphicData>
+            </a:graphic>
+          </wp:inline>
+        </w:drawing>
+      </w:r>
+    </w:p>
+    <w:p>
+      <w:r>
+        <w:lastRenderedPageBreak/>
+        <w:drawing>
+          <wp:inline distT="0" distB="0" distL="0" distR="0" wp14:anchorId="256E4A83" wp14:editId="33092CED">
+            <wp:extent cx="5731510" cy="3044190"/>
+            <wp:effectExtent l="0" t="0" r="2540" b="3810"/>
+            <wp:docPr id="1051902307" name="Picture 1"/>
+            <wp:cNvGraphicFramePr>
+              <a:graphicFrameLocks xmlns:a="http://schemas.openxmlformats.org/drawingml/2006/main" noChangeAspect="1"/>
+            </wp:cNvGraphicFramePr>
+            <a:graphic xmlns:a="http://schemas.openxmlformats.org/drawingml/2006/main">
+              <a:graphicData uri="http://schemas.openxmlformats.org/drawingml/2006/picture">
+                <pic:pic xmlns:pic="http://schemas.openxmlformats.org/drawingml/2006/picture">
+                  <pic:nvPicPr>
+                    <pic:cNvPr id="1051902307" name=""/>
+                    <pic:cNvPicPr/>
+                  </pic:nvPicPr>
+                  <pic:blipFill>
+                    <a:blip r:embed="rId32"/>
+                    <a:stretch>
+                      <a:fillRect/>
+                    </a:stretch>
+                  </pic:blipFill>
+                  <pic:spPr>
+                    <a:xfrm>
+                      <a:off x="0" y="0"/>
+                      <a:ext cx="5731510" cy="3044190"/>
+                    </a:xfrm>
+                    <a:prstGeom prst="rect">
+                      <a:avLst/>
+                    </a:prstGeom>
+                  </pic:spPr>
+                </pic:pic>
+              </a:graphicData>
+            </a:graphic>
+          </wp:inline>
+        </w:drawing>
+      </w:r>
+    </w:p>
+    <w:p/>
     <w:p>
       <w:r>
         <w:rPr>
           <w:noProof/>
         </w:rPr>
-        <w:lastRenderedPageBreak/>
         <w:drawing>
           <wp:inline distT="0" distB="0" distL="0" distR="0" wp14:anchorId="160D8BFE" wp14:editId="4206A9CB">
             <wp:extent cx="5731510" cy="2541270"/>
@@ -1803,7 +1959,7 @@
                     <pic:cNvPicPr/>
                   </pic:nvPicPr>
                   <pic:blipFill>
-                    <a:blip r:embed="rId30"/>
+                    <a:blip r:embed="rId33"/>
                     <a:stretch>
                       <a:fillRect/>
                     </a:stretch>
@@ -1845,7 +2001,7 @@
                     <pic:cNvPicPr/>
                   </pic:nvPicPr>
                   <pic:blipFill>
-                    <a:blip r:embed="rId31"/>
+                    <a:blip r:embed="rId34"/>
                     <a:stretch>
                       <a:fillRect/>
                     </a:stretch>
@@ -1871,6 +2027,7 @@
         <w:rPr>
           <w:noProof/>
         </w:rPr>
+        <w:lastRenderedPageBreak/>
         <w:drawing>
           <wp:inline distT="0" distB="0" distL="0" distR="0" wp14:anchorId="56AB59EC" wp14:editId="14FD72E1">
             <wp:extent cx="5731510" cy="2848610"/>
@@ -1887,7 +2044,7 @@
                     <pic:cNvPicPr/>
                   </pic:nvPicPr>
                   <pic:blipFill>
-                    <a:blip r:embed="rId32"/>
+                    <a:blip r:embed="rId35"/>
                     <a:stretch>
                       <a:fillRect/>
                     </a:stretch>
@@ -1913,7 +2070,6 @@
         <w:rPr>
           <w:noProof/>
         </w:rPr>
-        <w:lastRenderedPageBreak/>
         <w:drawing>
           <wp:inline distT="0" distB="0" distL="0" distR="0" wp14:anchorId="11A2CB1A" wp14:editId="5294EC5F">
             <wp:extent cx="5731510" cy="2440940"/>
@@ -1930,7 +2086,7 @@
                     <pic:cNvPicPr/>
                   </pic:nvPicPr>
                   <pic:blipFill>
-                    <a:blip r:embed="rId33"/>
+                    <a:blip r:embed="rId36"/>
                     <a:stretch>
                       <a:fillRect/>
                     </a:stretch>
@@ -1973,7 +2129,7 @@
                     <pic:cNvPicPr/>
                   </pic:nvPicPr>
                   <pic:blipFill>
-                    <a:blip r:embed="rId34"/>
+                    <a:blip r:embed="rId37"/>
                     <a:stretch>
                       <a:fillRect/>
                     </a:stretch>

</xml_diff>